<commit_message>
Add minor fixes to CV
</commit_message>
<xml_diff>
--- a/static/Georgios Kontosis_new.docx
+++ b/static/Georgios Kontosis_new.docx
@@ -456,6 +456,7 @@
     </w:p>
     <w:p>
       <w:pPr>
+        <w:jc w:val="both"/>
         <w:rPr>
           <w:rFonts w:ascii="Calibri" w:hAnsi="Calibri" w:cs="Calibri"/>
           <w:sz w:val="20"/>
@@ -555,6 +556,7 @@
     </w:p>
     <w:p>
       <w:pPr>
+        <w:jc w:val="both"/>
         <w:rPr>
           <w:rFonts w:ascii="Calibri" w:hAnsi="Calibri" w:cs="Calibri"/>
           <w:sz w:val="20"/>
@@ -569,7 +571,57 @@
           <w:sz w:val="20"/>
           <w:szCs w:val="20"/>
         </w:rPr>
-        <w:t>Technologies:</w:t>
+        <w:t>Technologies</w:t>
+      </w:r>
+      <w:r>
+        <w:rPr>
+          <w:rFonts w:ascii="Calibri" w:hAnsi="Calibri" w:cs="Calibri"/>
+          <w:b/>
+          <w:bCs/>
+          <w:sz w:val="20"/>
+          <w:szCs w:val="20"/>
+        </w:rPr>
+        <w:t xml:space="preserve"> </w:t>
+      </w:r>
+      <w:r>
+        <w:rPr>
+          <w:rFonts w:ascii="Calibri" w:hAnsi="Calibri" w:cs="Calibri"/>
+          <w:b/>
+          <w:bCs/>
+          <w:sz w:val="20"/>
+          <w:szCs w:val="20"/>
+        </w:rPr>
+        <w:t>-</w:t>
+      </w:r>
+      <w:r>
+        <w:rPr>
+          <w:rFonts w:ascii="Calibri" w:hAnsi="Calibri" w:cs="Calibri"/>
+          <w:b/>
+          <w:bCs/>
+          <w:sz w:val="20"/>
+          <w:szCs w:val="20"/>
+        </w:rPr>
+        <w:t xml:space="preserve"> </w:t>
+      </w:r>
+      <w:r>
+        <w:rPr>
+          <w:rFonts w:ascii="Calibri" w:hAnsi="Calibri" w:cs="Calibri"/>
+          <w:b/>
+          <w:bCs/>
+          <w:sz w:val="20"/>
+          <w:szCs w:val="20"/>
+        </w:rPr>
+        <w:t>Tools</w:t>
+      </w:r>
+      <w:r>
+        <w:rPr>
+          <w:rFonts w:ascii="Calibri" w:hAnsi="Calibri" w:cs="Calibri"/>
+          <w:b/>
+          <w:bCs/>
+          <w:sz w:val="20"/>
+          <w:szCs w:val="20"/>
+        </w:rPr>
+        <w:t>:</w:t>
       </w:r>
       <w:r>
         <w:rPr>
@@ -726,6 +778,7 @@
     </w:p>
     <w:p>
       <w:pPr>
+        <w:jc w:val="both"/>
         <w:rPr>
           <w:rFonts w:ascii="Calibri" w:hAnsi="Calibri" w:cs="Calibri"/>
         </w:rPr>
@@ -1452,25 +1505,7 @@
           <w:sz w:val="20"/>
           <w:szCs w:val="20"/>
         </w:rPr>
-        <w:t xml:space="preserve">credit origination new </w:t>
-      </w:r>
-      <w:r>
-        <w:rPr>
-          <w:rFonts w:ascii="Calibri" w:hAnsi="Calibri" w:cs="Calibri"/>
-          <w:color w:val="000000" w:themeColor="text1"/>
-          <w:sz w:val="20"/>
-          <w:szCs w:val="20"/>
-        </w:rPr>
-        <w:t>era-</w:t>
-      </w:r>
-      <w:r>
-        <w:rPr>
-          <w:rFonts w:ascii="Calibri" w:hAnsi="Calibri" w:cs="Calibri"/>
-          <w:color w:val="000000" w:themeColor="text1"/>
-          <w:sz w:val="20"/>
-          <w:szCs w:val="20"/>
-        </w:rPr>
-        <w:t xml:space="preserve">system by decoupling </w:t>
+        <w:t xml:space="preserve">credit origination system by decoupling </w:t>
       </w:r>
       <w:r>
         <w:rPr>
@@ -2584,7 +2619,25 @@
           <w:sz w:val="20"/>
           <w:szCs w:val="20"/>
         </w:rPr>
-        <w:t xml:space="preserve">Internally rotated to lead credit origination system redesign, transforming monolith to </w:t>
+        <w:t xml:space="preserve">Internally rotated to lead </w:t>
+      </w:r>
+      <w:r>
+        <w:rPr>
+          <w:rFonts w:ascii="Calibri" w:hAnsi="Calibri" w:cs="Calibri"/>
+          <w:color w:val="000000" w:themeColor="text1"/>
+          <w:sz w:val="20"/>
+          <w:szCs w:val="20"/>
+        </w:rPr>
+        <w:t xml:space="preserve">the </w:t>
+      </w:r>
+      <w:r>
+        <w:rPr>
+          <w:rFonts w:ascii="Calibri" w:hAnsi="Calibri" w:cs="Calibri"/>
+          <w:color w:val="000000" w:themeColor="text1"/>
+          <w:sz w:val="20"/>
+          <w:szCs w:val="20"/>
+        </w:rPr>
+        <w:t xml:space="preserve">credit origination system redesign, transforming monolith to </w:t>
       </w:r>
       <w:r>
         <w:rPr>
@@ -2954,7 +3007,16 @@
           <w:sz w:val="20"/>
           <w:szCs w:val="20"/>
         </w:rPr>
-        <w:t>5 mi</w:t>
+        <w:t>8</w:t>
+      </w:r>
+      <w:r>
+        <w:rPr>
+          <w:rFonts w:ascii="Calibri" w:hAnsi="Calibri" w:cs="Calibri"/>
+          <w:color w:val="000000" w:themeColor="text1"/>
+          <w:sz w:val="20"/>
+          <w:szCs w:val="20"/>
+        </w:rPr>
+        <w:t xml:space="preserve"> mi</w:t>
       </w:r>
       <w:r>
         <w:rPr>
@@ -3341,6 +3403,7 @@
         </w:rPr>
         <w:t xml:space="preserve">, </w:t>
       </w:r>
+      <w:proofErr w:type="spellStart"/>
       <w:r>
         <w:rPr>
           <w:rFonts w:ascii="Calibri" w:hAnsi="Calibri" w:cs="Calibri"/>
@@ -3352,6 +3415,7 @@
         </w:rPr>
         <w:t>Checkstyle</w:t>
       </w:r>
+      <w:proofErr w:type="spellEnd"/>
       <w:r>
         <w:rPr>
           <w:rFonts w:ascii="Calibri" w:hAnsi="Calibri" w:cs="Calibri"/>
@@ -7498,6 +7562,7 @@
   <w:style w:type="character" w:default="1" w:styleId="DefaultParagraphFont">
     <w:name w:val="Default Paragraph Font"/>
     <w:uiPriority w:val="1"/>
+    <w:semiHidden/>
     <w:unhideWhenUsed/>
   </w:style>
   <w:style w:type="table" w:default="1" w:styleId="TableNormal">

</xml_diff>